<commit_message>
Sprint I follow-ups: Node 20 verification, code review recorded, repo made public
- Baseline re-run under Node 20.20.2 (via npx) on an anonymous clone: install,
  typecheck, 36 tests, smoke all exit 0; evidence committed.
- AI log Entry 18: student reviewed the generated code, no changes.
- Repo made public after a 19-commit secrets scan; soft exposures disclosed.
- Submission document regenerated from the updated files.

Co-Authored-By: Claude Sonnet 5.5 <noreply@anthropic.com>
</commit_message>
<xml_diff>
--- a/docs/CISC699_Sprint1_Checkin.docx
+++ b/docs/CISC699_Sprint1_Checkin.docx
@@ -669,7 +669,7 @@
                 <w:sz w:val="22"/>
                 <w:szCs w:val="22"/>
               </w:rPr>
-              <w:t xml:space="preserve">Verified by execution rather than reading: type-check clean before and after; 36 tests pass; a mutation check showed the regression tests fail against the original buggy logic; the documented steps were run on a fresh git clone in an empty directory (all exit codes 0); cdk synth succeeded on the author's machine. Two AI errors were caught and fixed during the sprint: an unpinned ts-node dependency, and a first evidence file with a blank exit code and a hand-typed line, which was regenerated from a capture script. Not verified: behavior under Node 20, and synth on a machine without the author's AWS setup.</w:t>
+              <w:t xml:space="preserve">Verified by execution rather than reading: type-check clean before and after; 36 tests pass; a mutation check showed the regression tests fail against the original buggy logic; the documented steps were run on a fresh git clone in an empty directory (all exit codes 0); cdk synth succeeded on the author's machine. Two AI errors were caught and fixed during the sprint: an unpinned ts-node dependency, and a first evidence file with a blank exit code and a hand-typed line, which was regenerated from a capture script. Verified later (2026-10-04): the same steps pass under Node 20.20.2 (supplied temporarily via npx) on an anonymous clone of the public repo, with no engine warning; evidence in docs/evidence/sprint-1/node20-output.txt. Still not verified: synth on a machine without the author's AWS setup.</w:t>
             </w:r>
           </w:p>
         </w:tc>
@@ -725,7 +725,7 @@
                 <w:sz w:val="22"/>
                 <w:szCs w:val="22"/>
               </w:rPr>
-              <w:t xml:space="preserve">The student set the design and scope (archetype blending, three profiles, as approved by the supervisor on 2026-09-27) and requested this sprint build. The student's own line-by-line review of the generated code is the student's to confirm before submission; this entry will be updated if the student changes anything.</w:t>
+              <w:t xml:space="preserve">The student set the design and scope (archetype blending, three profiles, as approved by the supervisor on 2026-09-27) and requested this sprint build. The student reviewed the generated code and reported on 2026-10-04 that it looks good, and made no changes to it.</w:t>
             </w:r>
           </w:p>
         </w:tc>
@@ -780,15 +780,15 @@
           <w:sz w:val="22"/>
           <w:szCs w:val="22"/>
         </w:rPr>
-        <w:t xml:space="preserve">Not yet confirmed:</w:t>
-      </w:r>
-      <w:r>
-        <w:rPr>
-          <w:rFonts w:ascii="Calibri" w:cs="Calibri" w:eastAsia="Calibri" w:hAnsi="Calibri"/>
-          <w:sz w:val="22"/>
-          <w:szCs w:val="22"/>
-        </w:rPr>
-        <w:t xml:space="preserve"> the student's own line-by-line review of the generated code. The student should confirm that review (or note changes) before relying on this entry; the log will be updated accordingly.</w:t>
+        <w:t xml:space="preserve">Human review:</w:t>
+      </w:r>
+      <w:r>
+        <w:rPr>
+          <w:rFonts w:ascii="Calibri" w:cs="Calibri" w:eastAsia="Calibri" w:hAnsi="Calibri"/>
+          <w:sz w:val="22"/>
+          <w:szCs w:val="22"/>
+        </w:rPr>
+        <w:t xml:space="preserve"> the student reviewed the generated code and reported on October 4, 2026 that it looks good, with no changes made.</w:t>
       </w:r>
     </w:p>
     <w:p>
@@ -945,7 +945,7 @@
                 <w:sz w:val="22"/>
                 <w:szCs w:val="22"/>
               </w:rPr>
-              <w:t xml:space="preserve">https://github.com/manojvprimary/rescuenet (private; see the access note below)</w:t>
+              <w:t xml:space="preserve">https://github.com/manojvprimary/rescuenet (public)</w:t>
             </w:r>
           </w:p>
         </w:tc>
@@ -1088,6 +1088,62 @@
                 <w:sz w:val="22"/>
                 <w:szCs w:val="22"/>
               </w:rPr>
+              <w:t xml:space="preserve">Tag page</w:t>
+            </w:r>
+          </w:p>
+        </w:tc>
+        <w:tc>
+          <w:tcPr>
+            <w:tcW w:type="dxa" w:w="7360"/>
+            <w:tcMar>
+              <w:top w:type="dxa" w:w="60"/>
+              <w:left w:type="dxa" w:w="90"/>
+              <w:bottom w:type="dxa" w:w="60"/>
+              <w:right w:type="dxa" w:w="90"/>
+            </w:tcMar>
+            <w:vAlign w:val="top"/>
+          </w:tcPr>
+          <w:p>
+            <w:pPr>
+              <w:spacing w:after="0" w:before="0" w:line="240"/>
+            </w:pPr>
+            <w:r>
+              <w:rPr>
+                <w:rFonts w:ascii="Calibri" w:cs="Calibri" w:eastAsia="Calibri" w:hAnsi="Calibri"/>
+                <w:sz w:val="22"/>
+                <w:szCs w:val="22"/>
+              </w:rPr>
+              <w:t xml:space="preserve">https://github.com/manojvprimary/rescuenet/releases/tag/v0.1.0-baseline</w:t>
+            </w:r>
+          </w:p>
+        </w:tc>
+      </w:tr>
+      <w:tr>
+        <w:trPr>
+          <w:cantSplit/>
+          <w:tblHeader w:val="off"/>
+        </w:trPr>
+        <w:tc>
+          <w:tcPr>
+            <w:tcW w:type="dxa" w:w="2000"/>
+            <w:tcMar>
+              <w:top w:type="dxa" w:w="60"/>
+              <w:left w:type="dxa" w:w="90"/>
+              <w:bottom w:type="dxa" w:w="60"/>
+              <w:right w:type="dxa" w:w="90"/>
+            </w:tcMar>
+            <w:vAlign w:val="top"/>
+          </w:tcPr>
+          <w:p>
+            <w:pPr>
+              <w:spacing w:after="0" w:before="0" w:line="240"/>
+            </w:pPr>
+            <w:r>
+              <w:rPr>
+                <w:rFonts w:ascii="Calibri" w:cs="Calibri" w:eastAsia="Calibri" w:hAnsi="Calibri"/>
+                <w:sz w:val="22"/>
+                <w:szCs w:val="22"/>
+              </w:rPr>
               <w:t xml:space="preserve">Repository export</w:t>
             </w:r>
           </w:p>
@@ -1169,7 +1225,7 @@
                 <w:sz w:val="22"/>
                 <w:szCs w:val="22"/>
               </w:rPr>
-              <w:t xml:space="preserve">docs/evidence/sprint-1/smoke-output.txt and mutation-check.txt</w:t>
+              <w:t xml:space="preserve">docs/evidence/sprint-1/: smoke-output.txt, node20-output.txt, mutation-check.txt</w:t>
             </w:r>
           </w:p>
         </w:tc>
@@ -1313,7 +1369,7 @@
           <w:sz w:val="22"/>
           <w:szCs w:val="22"/>
         </w:rPr>
-        <w:t xml:space="preserve"> the repository is private. If the grader needs to browse it, the student must add them as a collaborator; the attached export contains the same tagged snapshot.</w:t>
+        <w:t xml:space="preserve"> the repository was made public on October 4, 2026 after a secrets scan of all 19 commits found no keys or tokens. The attached export contains the same tagged snapshot. Known soft exposures, none of them credentials: an AWS account ID in the Hard Stop 2 document and two Slack channel IDs in lib/constants.ts.</w:t>
       </w:r>
     </w:p>
     <w:p>
@@ -2873,7 +2929,7 @@
           <w:sz w:val="22"/>
           <w:szCs w:val="22"/>
         </w:rPr>
-        <w:t xml:space="preserve"> the pushed branch was cloned into an empty directory and the steps above were run; results are in Section 6. Limits: this machine runs Node 25.9 (not the production Node 20) and does not have nvm, so the Node 20 path is documented but unverified.</w:t>
+        <w:t xml:space="preserve"> the pushed branch was cloned into an empty directory and the steps above were run; results are in Section 6. A second run used the public repo anonymously and Node 20.20.2 (the production major version, supplied temporarily through npx; nothing installed), because this machine's default is Node 25.9. Both runs are shown in Section 6. Not verified: cdk synth on a machine without the author's AWS configuration.</w:t>
       </w:r>
     </w:p>
     <w:p>
@@ -4930,6 +4986,341 @@
         </w:rPr>
         <w:br/>
         <w:t xml:space="preserve">(Stacks: RescueNetStorage, RescueNetDatabase, RescueNetMessaging, RescueNetApi, RescueNetLambda)</w:t>
+      </w:r>
+      <w:r>
+        <w:rPr>
+          <w:rFonts w:ascii="Courier New" w:cs="Courier New" w:eastAsia="Courier New" w:hAnsi="Courier New"/>
+          <w:sz w:val="16"/>
+          <w:szCs w:val="16"/>
+        </w:rPr>
+        <w:br/>
+        <w:t xml:space="preserve"/>
+      </w:r>
+    </w:p>
+    <w:p>
+      <w:pPr>
+        <w:keepNext/>
+        <w:spacing w:after="60" w:before="120" w:line="264"/>
+      </w:pPr>
+      <w:r>
+        <w:rPr>
+          <w:rFonts w:ascii="Calibri" w:cs="Calibri" w:eastAsia="Calibri" w:hAnsi="Calibri"/>
+          <w:b/>
+          <w:bCs/>
+          <w:i/>
+          <w:iCs/>
+          <w:sz w:val="22"/>
+          <w:szCs w:val="22"/>
+        </w:rPr>
+        <w:t xml:space="preserve">Re-run under Node 20.20.2 on an anonymous clone of the public repo</w:t>
+      </w:r>
+    </w:p>
+    <w:p>
+      <w:pPr>
+        <w:pBdr>
+          <w:top w:val="single" w:color="CCCCCC" w:sz="2"/>
+          <w:left w:val="single" w:color="CCCCCC" w:sz="2"/>
+          <w:bottom w:val="single" w:color="CCCCCC" w:sz="2"/>
+          <w:right w:val="single" w:color="CCCCCC" w:sz="2"/>
+        </w:pBdr>
+        <w:shd w:fill="F2F2F2" w:val="clear"/>
+        <w:spacing w:after="160" w:before="80" w:line="230"/>
+      </w:pPr>
+      <w:r>
+        <w:rPr>
+          <w:rFonts w:ascii="Courier New" w:cs="Courier New" w:eastAsia="Courier New" w:hAnsi="Courier New"/>
+          <w:sz w:val="16"/>
+          <w:szCs w:val="16"/>
+        </w:rPr>
+        <w:t xml:space="preserve"># Sprint I verification under Node 20 (the Lambda production major version)</w:t>
+      </w:r>
+      <w:r>
+        <w:rPr>
+          <w:rFonts w:ascii="Courier New" w:cs="Courier New" w:eastAsia="Courier New" w:hAnsi="Courier New"/>
+          <w:sz w:val="16"/>
+          <w:szCs w:val="16"/>
+        </w:rPr>
+        <w:br/>
+        <w:t xml:space="preserve">Captured: 2026-10-04 19:21:54 EDT</w:t>
+      </w:r>
+      <w:r>
+        <w:rPr>
+          <w:rFonts w:ascii="Courier New" w:cs="Courier New" w:eastAsia="Courier New" w:hAnsi="Courier New"/>
+          <w:sz w:val="16"/>
+          <w:szCs w:val="16"/>
+        </w:rPr>
+        <w:br/>
+        <w:t xml:space="preserve">Source: anonymous 'git clone' of the now-public repo, branch main, commit bfc2116 (code identical to tag v0.1.0-baseline; later commits add documentation only)</w:t>
+      </w:r>
+      <w:r>
+        <w:rPr>
+          <w:rFonts w:ascii="Courier New" w:cs="Courier New" w:eastAsia="Courier New" w:hAnsi="Courier New"/>
+          <w:sz w:val="16"/>
+          <w:szCs w:val="16"/>
+        </w:rPr>
+        <w:br/>
+        <w:t xml:space="preserve">Node used for every command below: v20.20.2  (machine default is v25.9.0; Node 20 supplied temporarily via npx, nothing installed)</w:t>
+      </w:r>
+      <w:r>
+        <w:rPr>
+          <w:rFonts w:ascii="Courier New" w:cs="Courier New" w:eastAsia="Courier New" w:hAnsi="Courier New"/>
+          <w:sz w:val="16"/>
+          <w:szCs w:val="16"/>
+        </w:rPr>
+        <w:br/>
+        <w:t xml:space="preserve"/>
+      </w:r>
+      <w:r>
+        <w:rPr>
+          <w:rFonts w:ascii="Courier New" w:cs="Courier New" w:eastAsia="Courier New" w:hAnsi="Courier New"/>
+          <w:sz w:val="16"/>
+          <w:szCs w:val="16"/>
+        </w:rPr>
+        <w:br/>
+        <w:t xml:space="preserve">$ npm ci</w:t>
+      </w:r>
+      <w:r>
+        <w:rPr>
+          <w:rFonts w:ascii="Courier New" w:cs="Courier New" w:eastAsia="Courier New" w:hAnsi="Courier New"/>
+          <w:sz w:val="16"/>
+          <w:szCs w:val="16"/>
+        </w:rPr>
+        <w:br/>
+        <w:t xml:space="preserve">added 348 packages in 3s</w:t>
+      </w:r>
+      <w:r>
+        <w:rPr>
+          <w:rFonts w:ascii="Courier New" w:cs="Courier New" w:eastAsia="Courier New" w:hAnsi="Courier New"/>
+          <w:sz w:val="16"/>
+          <w:szCs w:val="16"/>
+        </w:rPr>
+        <w:br/>
+        <w:t xml:space="preserve">exit code: 0</w:t>
+      </w:r>
+      <w:r>
+        <w:rPr>
+          <w:rFonts w:ascii="Courier New" w:cs="Courier New" w:eastAsia="Courier New" w:hAnsi="Courier New"/>
+          <w:sz w:val="16"/>
+          <w:szCs w:val="16"/>
+        </w:rPr>
+        <w:br/>
+        <w:t xml:space="preserve"/>
+      </w:r>
+      <w:r>
+        <w:rPr>
+          <w:rFonts w:ascii="Courier New" w:cs="Courier New" w:eastAsia="Courier New" w:hAnsi="Courier New"/>
+          <w:sz w:val="16"/>
+          <w:szCs w:val="16"/>
+        </w:rPr>
+        <w:br/>
+        <w:t xml:space="preserve">$ npm run typecheck</w:t>
+      </w:r>
+      <w:r>
+        <w:rPr>
+          <w:rFonts w:ascii="Courier New" w:cs="Courier New" w:eastAsia="Courier New" w:hAnsi="Courier New"/>
+          <w:sz w:val="16"/>
+          <w:szCs w:val="16"/>
+        </w:rPr>
+        <w:br/>
+        <w:t xml:space="preserve">&gt; rescuenet@1.0.0 typecheck</w:t>
+      </w:r>
+      <w:r>
+        <w:rPr>
+          <w:rFonts w:ascii="Courier New" w:cs="Courier New" w:eastAsia="Courier New" w:hAnsi="Courier New"/>
+          <w:sz w:val="16"/>
+          <w:szCs w:val="16"/>
+        </w:rPr>
+        <w:br/>
+        <w:t xml:space="preserve">&gt; tsc --noEmit</w:t>
+      </w:r>
+      <w:r>
+        <w:rPr>
+          <w:rFonts w:ascii="Courier New" w:cs="Courier New" w:eastAsia="Courier New" w:hAnsi="Courier New"/>
+          <w:sz w:val="16"/>
+          <w:szCs w:val="16"/>
+        </w:rPr>
+        <w:br/>
+        <w:t xml:space="preserve">exit code: 0</w:t>
+      </w:r>
+      <w:r>
+        <w:rPr>
+          <w:rFonts w:ascii="Courier New" w:cs="Courier New" w:eastAsia="Courier New" w:hAnsi="Courier New"/>
+          <w:sz w:val="16"/>
+          <w:szCs w:val="16"/>
+        </w:rPr>
+        <w:br/>
+        <w:t xml:space="preserve"/>
+      </w:r>
+      <w:r>
+        <w:rPr>
+          <w:rFonts w:ascii="Courier New" w:cs="Courier New" w:eastAsia="Courier New" w:hAnsi="Courier New"/>
+          <w:sz w:val="16"/>
+          <w:szCs w:val="16"/>
+        </w:rPr>
+        <w:br/>
+        <w:t xml:space="preserve">$ npm test</w:t>
+      </w:r>
+      <w:r>
+        <w:rPr>
+          <w:rFonts w:ascii="Courier New" w:cs="Courier New" w:eastAsia="Courier New" w:hAnsi="Courier New"/>
+          <w:sz w:val="16"/>
+          <w:szCs w:val="16"/>
+        </w:rPr>
+        <w:br/>
+        <w:t xml:space="preserve">PASS test/scoring.test.ts (5.711 s)</w:t>
+      </w:r>
+      <w:r>
+        <w:rPr>
+          <w:rFonts w:ascii="Courier New" w:cs="Courier New" w:eastAsia="Courier New" w:hAnsi="Courier New"/>
+          <w:sz w:val="16"/>
+          <w:szCs w:val="16"/>
+        </w:rPr>
+        <w:br/>
+        <w:t xml:space="preserve">PASS test/weights.test.ts (5.758 s)</w:t>
+      </w:r>
+      <w:r>
+        <w:rPr>
+          <w:rFonts w:ascii="Courier New" w:cs="Courier New" w:eastAsia="Courier New" w:hAnsi="Courier New"/>
+          <w:sz w:val="16"/>
+          <w:szCs w:val="16"/>
+        </w:rPr>
+        <w:br/>
+        <w:t xml:space="preserve">Test Suites: 2 passed, 2 total</w:t>
+      </w:r>
+      <w:r>
+        <w:rPr>
+          <w:rFonts w:ascii="Courier New" w:cs="Courier New" w:eastAsia="Courier New" w:hAnsi="Courier New"/>
+          <w:sz w:val="16"/>
+          <w:szCs w:val="16"/>
+        </w:rPr>
+        <w:br/>
+        <w:t xml:space="preserve">Tests:       36 passed, 36 total</w:t>
+      </w:r>
+      <w:r>
+        <w:rPr>
+          <w:rFonts w:ascii="Courier New" w:cs="Courier New" w:eastAsia="Courier New" w:hAnsi="Courier New"/>
+          <w:sz w:val="16"/>
+          <w:szCs w:val="16"/>
+        </w:rPr>
+        <w:br/>
+        <w:t xml:space="preserve">exit code: 0</w:t>
+      </w:r>
+      <w:r>
+        <w:rPr>
+          <w:rFonts w:ascii="Courier New" w:cs="Courier New" w:eastAsia="Courier New" w:hAnsi="Courier New"/>
+          <w:sz w:val="16"/>
+          <w:szCs w:val="16"/>
+        </w:rPr>
+        <w:br/>
+        <w:t xml:space="preserve"/>
+      </w:r>
+      <w:r>
+        <w:rPr>
+          <w:rFonts w:ascii="Courier New" w:cs="Courier New" w:eastAsia="Courier New" w:hAnsi="Courier New"/>
+          <w:sz w:val="16"/>
+          <w:szCs w:val="16"/>
+        </w:rPr>
+        <w:br/>
+        <w:t xml:space="preserve">$ npm run smoke</w:t>
+      </w:r>
+      <w:r>
+        <w:rPr>
+          <w:rFonts w:ascii="Courier New" w:cs="Courier New" w:eastAsia="Courier New" w:hAnsi="Courier New"/>
+          <w:sz w:val="16"/>
+          <w:szCs w:val="16"/>
+        </w:rPr>
+        <w:br/>
+        <w:t xml:space="preserve">weights version: v0-placeholder (placeholder equal vectors until the Week 6 AHP elicitation)</w:t>
+      </w:r>
+      <w:r>
+        <w:rPr>
+          <w:rFonts w:ascii="Courier New" w:cs="Courier New" w:eastAsia="Courier New" w:hAnsi="Courier New"/>
+          <w:sz w:val="16"/>
+          <w:szCs w:val="16"/>
+        </w:rPr>
+        <w:br/>
+        <w:t xml:space="preserve">PASS  shipped vectors load and validate</w:t>
+      </w:r>
+      <w:r>
+        <w:rPr>
+          <w:rFonts w:ascii="Courier New" w:cs="Courier New" w:eastAsia="Courier New" w:hAnsi="Courier New"/>
+          <w:sz w:val="16"/>
+          <w:szCs w:val="16"/>
+        </w:rPr>
+        <w:br/>
+        <w:t xml:space="preserve">PASS  critical injury: weights sum to 1</w:t>
+      </w:r>
+      <w:r>
+        <w:rPr>
+          <w:rFonts w:ascii="Courier New" w:cs="Courier New" w:eastAsia="Courier New" w:hAnsi="Courier New"/>
+          <w:sz w:val="16"/>
+          <w:szCs w:val="16"/>
+        </w:rPr>
+        <w:br/>
+        <w:t xml:space="preserve">PASS  routine stray: weights sum to 1</w:t>
+      </w:r>
+      <w:r>
+        <w:rPr>
+          <w:rFonts w:ascii="Courier New" w:cs="Courier New" w:eastAsia="Courier New" w:hAnsi="Courier New"/>
+          <w:sz w:val="16"/>
+          <w:szCs w:val="16"/>
+        </w:rPr>
+        <w:br/>
+        <w:t xml:space="preserve">PASS  malformed model output: weights sum to 1</w:t>
+      </w:r>
+      <w:r>
+        <w:rPr>
+          <w:rFonts w:ascii="Courier New" w:cs="Courier New" w:eastAsia="Courier New" w:hAnsi="Courier New"/>
+          <w:sz w:val="16"/>
+          <w:szCs w:val="16"/>
+        </w:rPr>
+        <w:br/>
+        <w:t xml:space="preserve">PASS  malformed output used the fallback</w:t>
+      </w:r>
+      <w:r>
+        <w:rPr>
+          <w:rFonts w:ascii="Courier New" w:cs="Courier New" w:eastAsia="Courier New" w:hAnsi="Courier New"/>
+          <w:sz w:val="16"/>
+          <w:szCs w:val="16"/>
+        </w:rPr>
+        <w:br/>
+        <w:t xml:space="preserve">PASS  species check: dog shelter does not match a cat (old code scored this 0.85)</w:t>
+      </w:r>
+      <w:r>
+        <w:rPr>
+          <w:rFonts w:ascii="Courier New" w:cs="Courier New" w:eastAsia="Courier New" w:hAnsi="Courier New"/>
+          <w:sz w:val="16"/>
+          <w:szCs w:val="16"/>
+        </w:rPr>
+        <w:br/>
+        <w:t xml:space="preserve">PASS  species check: cat shelter matches a cat</w:t>
+      </w:r>
+      <w:r>
+        <w:rPr>
+          <w:rFonts w:ascii="Courier New" w:cs="Courier New" w:eastAsia="Courier New" w:hAnsi="Courier New"/>
+          <w:sz w:val="16"/>
+          <w:szCs w:val="16"/>
+        </w:rPr>
+        <w:br/>
+        <w:t xml:space="preserve">PASS  injured case weights vet care more than a routine case</w:t>
+      </w:r>
+      <w:r>
+        <w:rPr>
+          <w:rFonts w:ascii="Courier New" w:cs="Courier New" w:eastAsia="Courier New" w:hAnsi="Courier New"/>
+          <w:sz w:val="16"/>
+          <w:szCs w:val="16"/>
+        </w:rPr>
+        <w:br/>
+        <w:t xml:space="preserve">SMOKE TEST PASSED</w:t>
+      </w:r>
+      <w:r>
+        <w:rPr>
+          <w:rFonts w:ascii="Courier New" w:cs="Courier New" w:eastAsia="Courier New" w:hAnsi="Courier New"/>
+          <w:sz w:val="16"/>
+          <w:szCs w:val="16"/>
+        </w:rPr>
+        <w:br/>
+        <w:t xml:space="preserve">exit code: 0</w:t>
       </w:r>
       <w:r>
         <w:rPr>
@@ -6779,7 +7170,7 @@
                 <w:sz w:val="22"/>
                 <w:szCs w:val="22"/>
               </w:rPr>
-              <w:t xml:space="preserve"> added (documented, not enforced on this machine); run the final validation under Node 20 before Hard Stop 3.</w:t>
+              <w:t xml:space="preserve"> added; the full baseline (install, type-check, 36 tests, smoke) was run under Node 20.20.2 on 2026-10-04 and passed. Remaining: make Node 20 the local default.</w:t>
             </w:r>
           </w:p>
         </w:tc>
@@ -6829,7 +7220,7 @@
                 <w:sz w:val="22"/>
                 <w:szCs w:val="22"/>
               </w:rPr>
-              <w:t xml:space="preserve">Mitigating</w:t>
+              <w:t xml:space="preserve">Mitigating (verified under Node 20)</w:t>
             </w:r>
           </w:p>
         </w:tc>
@@ -9008,7 +9399,7 @@
           <w:sz w:val="16"/>
           <w:szCs w:val="16"/>
         </w:rPr>
-        <w:t xml:space="preserve">*   450f0cb Merge sprint-1/baseline: Sprint I engineering baseline (v0.1.0-baseline)</w:t>
+        <w:t xml:space="preserve">* bfc2116 Add Sprint I check-in submission document (generated from the repo's own files)</w:t>
       </w:r>
       <w:r>
         <w:rPr>
@@ -9017,7 +9408,7 @@
           <w:szCs w:val="16"/>
         </w:rPr>
         <w:br/>
-        <w:t xml:space="preserve">|\  </w:t>
+        <w:t xml:space="preserve">*   450f0cb Merge sprint-1/baseline: Sprint I engineering baseline (v0.1.0-baseline)</w:t>
       </w:r>
       <w:r>
         <w:rPr>
@@ -9026,7 +9417,7 @@
           <w:szCs w:val="16"/>
         </w:rPr>
         <w:br/>
-        <w:t xml:space="preserve">| * b78bdc1 Sprint I: evidence, reflection, AI-use log Entry 18, engineering log</w:t>
+        <w:t xml:space="preserve">|\  </w:t>
       </w:r>
       <w:r>
         <w:rPr>
@@ -9035,7 +9426,7 @@
           <w:szCs w:val="16"/>
         </w:rPr>
         <w:br/>
-        <w:t xml:space="preserve">| * 6a084a3 Sprint I baseline: tested weight derivation, species-check fix, and engineering docs</w:t>
+        <w:t xml:space="preserve">| * b78bdc1 Sprint I: evidence, reflection, AI-use log Entry 18, engineering log</w:t>
       </w:r>
       <w:r>
         <w:rPr>
@@ -9044,7 +9435,7 @@
           <w:szCs w:val="16"/>
         </w:rPr>
         <w:br/>
-        <w:t xml:space="preserve">|/  </w:t>
+        <w:t xml:space="preserve">| * 6a084a3 Sprint I baseline: tested weight derivation, species-check fix, and engineering docs</w:t>
       </w:r>
       <w:r>
         <w:rPr>
@@ -9053,7 +9444,7 @@
           <w:szCs w:val="16"/>
         </w:rPr>
         <w:br/>
-        <w:t xml:space="preserve">* 3a05469 Hard Stop 2: add the fairness-by-shelter-characteristic check (Week 2 feedback, second half)</w:t>
+        <w:t xml:space="preserve">|/  </w:t>
       </w:r>
       <w:r>
         <w:rPr>
@@ -9062,7 +9453,7 @@
           <w:szCs w:val="16"/>
         </w:rPr>
         <w:br/>
-        <w:t xml:space="preserve">* 0257c38 Hard Stop 2: incorporate supervisor's approval and deterministic-blend requirement</w:t>
+        <w:t xml:space="preserve">* 3a05469 Hard Stop 2: add the fairness-by-shelter-characteristic check (Week 2 feedback, second half)</w:t>
       </w:r>
       <w:r>
         <w:rPr>
@@ -9071,7 +9462,7 @@
           <w:szCs w:val="16"/>
         </w:rPr>
         <w:br/>
-        <w:t xml:space="preserve">* c81224c Hard Stop 2: record both supervisor emails as sent; no further email, document in assignments</w:t>
+        <w:t xml:space="preserve">* 0257c38 Hard Stop 2: incorporate supervisor's approval and deterministic-blend requirement</w:t>
       </w:r>
       <w:r>
         <w:rPr>
@@ -9080,7 +9471,7 @@
           <w:szCs w:val="16"/>
         </w:rPr>
         <w:br/>
-        <w:t xml:space="preserve">* ada8a8a Hard Stop 2 rubric audit: close gaps; correct data flow and RU-03 needs-table claim</w:t>
+        <w:t xml:space="preserve">* c81224c Hard Stop 2: record both supervisor emails as sent; no further email, document in assignments</w:t>
       </w:r>
     </w:p>
     <w:p>
@@ -9720,7 +10111,7 @@
           <w:sz w:val="22"/>
           <w:szCs w:val="22"/>
         </w:rPr>
-        <w:t xml:space="preserve">Not verified: the setup steps under Node 20 (this machine runs 25.9 and </w:t>
+        <w:t xml:space="preserve">Verified after the initial capture: the install, type-check, tests, and smoke test pass under Node 20.20.2 on an anonymous clone of the public repo (</w:t>
       </w:r>
       <w:r>
         <w:rPr>
@@ -9728,15 +10119,15 @@
           <w:sz w:val="20"/>
           <w:szCs w:val="20"/>
         </w:rPr>
-        <w:t xml:space="preserve">nvm</w:t>
-      </w:r>
-      <w:r>
-        <w:rPr>
-          <w:rFonts w:ascii="Calibri" w:cs="Calibri" w:eastAsia="Calibri" w:hAnsi="Calibri"/>
-          <w:sz w:val="22"/>
-          <w:szCs w:val="22"/>
-        </w:rPr>
-        <w:t xml:space="preserve"> is not installed), and </w:t>
+        <w:t xml:space="preserve">docs/evidence/sprint-1/node20-output.txt</w:t>
+      </w:r>
+      <w:r>
+        <w:rPr>
+          <w:rFonts w:ascii="Calibri" w:cs="Calibri" w:eastAsia="Calibri" w:hAnsi="Calibri"/>
+          <w:sz w:val="22"/>
+          <w:szCs w:val="22"/>
+        </w:rPr>
+        <w:t xml:space="preserve">). Not verified: </w:t>
       </w:r>
       <w:r>
         <w:rPr>
@@ -9857,15 +10248,15 @@
           <w:sz w:val="22"/>
           <w:szCs w:val="22"/>
         </w:rPr>
-        <w:t xml:space="preserve">Node 20:</w:t>
-      </w:r>
-      <w:r>
-        <w:rPr>
-          <w:rFonts w:ascii="Calibri" w:cs="Calibri" w:eastAsia="Calibri" w:hAnsi="Calibri"/>
-          <w:sz w:val="22"/>
-          <w:szCs w:val="22"/>
-        </w:rPr>
-        <w:t xml:space="preserve"> install it (or </w:t>
+        <w:t xml:space="preserve">Node 20 as the local default (R-05):</w:t>
+      </w:r>
+      <w:r>
+        <w:rPr>
+          <w:rFonts w:ascii="Calibri" w:cs="Calibri" w:eastAsia="Calibri" w:hAnsi="Calibri"/>
+          <w:sz w:val="22"/>
+          <w:szCs w:val="22"/>
+        </w:rPr>
+        <w:t xml:space="preserve"> the baseline already passes under Node 20 via </w:t>
       </w:r>
       <w:r>
         <w:rPr>
@@ -9873,15 +10264,15 @@
           <w:sz w:val="20"/>
           <w:szCs w:val="20"/>
         </w:rPr>
-        <w:t xml:space="preserve">nvm</w:t>
-      </w:r>
-      <w:r>
-        <w:rPr>
-          <w:rFonts w:ascii="Calibri" w:cs="Calibri" w:eastAsia="Calibri" w:hAnsi="Calibri"/>
-          <w:sz w:val="22"/>
-          <w:szCs w:val="22"/>
-        </w:rPr>
-        <w:t xml:space="preserve">) to run the final validation under the production major version (R-05).</w:t>
+        <w:t xml:space="preserve">npx</w:t>
+      </w:r>
+      <w:r>
+        <w:rPr>
+          <w:rFonts w:ascii="Calibri" w:cs="Calibri" w:eastAsia="Calibri" w:hAnsi="Calibri"/>
+          <w:sz w:val="22"/>
+          <w:szCs w:val="22"/>
+        </w:rPr>
+        <w:t xml:space="preserve">; installing Node 20 locally (nvm or Homebrew) would make everyday runs match production.</w:t>
       </w:r>
     </w:p>
     <w:p>
@@ -20249,7 +20640,7 @@
                 <w:sz w:val="22"/>
                 <w:szCs w:val="22"/>
               </w:rPr>
-              <w:t xml:space="preserve">Verified by execution rather than reading: type-check clean before and after; 36 tests pass; a mutation check showed the regression tests fail against the original buggy logic; the documented steps were run on a fresh git clone in an empty directory (all exit codes 0); cdk synth succeeded on the author's machine. Two AI errors were caught and fixed during the sprint: an unpinned ts-node dependency, and a first evidence file with a blank exit code and a hand-typed line, which was regenerated from a capture script. Not verified: behavior under Node 20, and synth on a machine without the author's AWS setup.</w:t>
+              <w:t xml:space="preserve">Verified by execution rather than reading: type-check clean before and after; 36 tests pass; a mutation check showed the regression tests fail against the original buggy logic; the documented steps were run on a fresh git clone in an empty directory (all exit codes 0); cdk synth succeeded on the author's machine. Two AI errors were caught and fixed during the sprint: an unpinned ts-node dependency, and a first evidence file with a blank exit code and a hand-typed line, which was regenerated from a capture script. Verified later (2026-10-04): the same steps pass under Node 20.20.2 (supplied temporarily via npx) on an anonymous clone of the public repo, with no engine warning; evidence in docs/evidence/sprint-1/node20-output.txt. Still not verified: synth on a machine without the author's AWS setup.</w:t>
             </w:r>
           </w:p>
         </w:tc>
@@ -20305,7 +20696,7 @@
                 <w:sz w:val="22"/>
                 <w:szCs w:val="22"/>
               </w:rPr>
-              <w:t xml:space="preserve">The student set the design and scope (archetype blending, three profiles, as approved by the supervisor on 2026-09-27) and requested this sprint build. The student's own line-by-line review of the generated code is the student's to confirm before submission; this entry will be updated if the student changes anything.</w:t>
+              <w:t xml:space="preserve">The student set the design and scope (archetype blending, three profiles, as approved by the supervisor on 2026-09-27) and requested this sprint build. The student reviewed the generated code and reported on 2026-10-04 that it looks good, and made no changes to it.</w:t>
             </w:r>
           </w:p>
         </w:tc>

</xml_diff>

<commit_message>
Sprint I check-in: embed the student's terminal screenshot as evidence
Co-Authored-By: Claude Sonnet 5.5 <noreply@anthropic.com>
</commit_message>
<xml_diff>
--- a/docs/CISC699_Sprint1_Checkin.docx
+++ b/docs/CISC699_Sprint1_Checkin.docx
@@ -5489,7 +5489,69 @@
           <w:sz w:val="22"/>
           <w:szCs w:val="22"/>
         </w:rPr>
-        <w:t xml:space="preserve">The smoke demo prints equal weights because the shipped vectors are placeholders; the case-specific blend is shown with clearly labeled illustrative vectors, and the unit tests exercise it with distinct vectors. Screenshots: the terminal output above can be re-run with the four commands in Section 4; the student may attach screenshots of the same run.</w:t>
+        <w:t xml:space="preserve">The smoke demo prints equal weights because the shipped vectors are placeholders; the case-specific blend is shown with clearly labeled illustrative vectors, and the unit tests exercise it with distinct vectors. The screenshot below, taken by the student, shows the same four steps run on main in the student's own terminal.</w:t>
+      </w:r>
+    </w:p>
+    <w:p>
+      <w:pPr>
+        <w:spacing w:after="0" w:before="120"/>
+        <w:jc w:val="center"/>
+      </w:pPr>
+      <w:r>
+        <w:drawing>
+          <wp:inline distT="0" distB="0" distL="0" distR="0">
+            <wp:extent cx="5762625" cy="5067300"/>
+            <wp:effectExtent t="0" r="0" b="0" l="0"/>
+            <wp:docPr id="1" name="" descr="" title=""/>
+            <wp:cNvGraphicFramePr>
+              <a:graphicFrameLocks xmlns:a="http://schemas.openxmlformats.org/drawingml/2006/main" noChangeAspect="1"/>
+            </wp:cNvGraphicFramePr>
+            <a:graphic xmlns:a="http://schemas.openxmlformats.org/drawingml/2006/main">
+              <a:graphicData uri="http://schemas.openxmlformats.org/drawingml/2006/picture">
+                <pic:pic xmlns:pic="http://schemas.openxmlformats.org/drawingml/2006/picture">
+                  <pic:nvPicPr>
+                    <pic:cNvPr id="0" name="" descr=""/>
+                    <pic:cNvPicPr>
+                      <a:picLocks noChangeAspect="1" noChangeArrowheads="1"/>
+                    </pic:cNvPicPr>
+                  </pic:nvPicPr>
+                  <pic:blipFill>
+                    <a:blip r:embed="rId7" cstate="none"/>
+                    <a:srcRect/>
+                    <a:stretch>
+                      <a:fillRect/>
+                    </a:stretch>
+                  </pic:blipFill>
+                  <pic:spPr bwMode="auto">
+                    <a:xfrm>
+                      <a:off x="0" y="0"/>
+                      <a:ext cx="5762625" cy="5067300"/>
+                    </a:xfrm>
+                    <a:prstGeom prst="rect">
+                      <a:avLst/>
+                    </a:prstGeom>
+                  </pic:spPr>
+                </pic:pic>
+              </a:graphicData>
+            </a:graphic>
+          </wp:inline>
+        </w:drawing>
+      </w:r>
+    </w:p>
+    <w:p>
+      <w:pPr>
+        <w:spacing w:after="160" w:before="60"/>
+        <w:jc w:val="center"/>
+      </w:pPr>
+      <w:r>
+        <w:rPr>
+          <w:rFonts w:ascii="Calibri" w:cs="Calibri" w:eastAsia="Calibri" w:hAnsi="Calibri"/>
+          <w:i/>
+          <w:iCs/>
+          <w:sz w:val="18"/>
+          <w:szCs w:val="18"/>
+        </w:rPr>
+        <w:t xml:space="preserve">Figure 1. Terminal screenshot, October 4, 2026: git describe and log (main is two documentation-only commits after tag v0.1.0-baseline), clean type-check, 36 of 36 tests passing, and SMOKE TEST PASSED.</w:t>
       </w:r>
     </w:p>
     <w:p>
@@ -9399,7 +9461,7 @@
           <w:sz w:val="16"/>
           <w:szCs w:val="16"/>
         </w:rPr>
-        <w:t xml:space="preserve">* bfc2116 Add Sprint I check-in submission document (generated from the repo's own files)</w:t>
+        <w:t xml:space="preserve">* b4780f8 Sprint I follow-ups: Node 20 verification, code review recorded, repo made public</w:t>
       </w:r>
       <w:r>
         <w:rPr>
@@ -9408,7 +9470,7 @@
           <w:szCs w:val="16"/>
         </w:rPr>
         <w:br/>
-        <w:t xml:space="preserve">*   450f0cb Merge sprint-1/baseline: Sprint I engineering baseline (v0.1.0-baseline)</w:t>
+        <w:t xml:space="preserve">* bfc2116 Add Sprint I check-in submission document (generated from the repo's own files)</w:t>
       </w:r>
       <w:r>
         <w:rPr>
@@ -9417,7 +9479,7 @@
           <w:szCs w:val="16"/>
         </w:rPr>
         <w:br/>
-        <w:t xml:space="preserve">|\  </w:t>
+        <w:t xml:space="preserve">*   450f0cb Merge sprint-1/baseline: Sprint I engineering baseline (v0.1.0-baseline)</w:t>
       </w:r>
       <w:r>
         <w:rPr>
@@ -9426,7 +9488,7 @@
           <w:szCs w:val="16"/>
         </w:rPr>
         <w:br/>
-        <w:t xml:space="preserve">| * b78bdc1 Sprint I: evidence, reflection, AI-use log Entry 18, engineering log</w:t>
+        <w:t xml:space="preserve">|\  </w:t>
       </w:r>
       <w:r>
         <w:rPr>
@@ -9435,7 +9497,7 @@
           <w:szCs w:val="16"/>
         </w:rPr>
         <w:br/>
-        <w:t xml:space="preserve">| * 6a084a3 Sprint I baseline: tested weight derivation, species-check fix, and engineering docs</w:t>
+        <w:t xml:space="preserve">| * b78bdc1 Sprint I: evidence, reflection, AI-use log Entry 18, engineering log</w:t>
       </w:r>
       <w:r>
         <w:rPr>
@@ -9444,7 +9506,7 @@
           <w:szCs w:val="16"/>
         </w:rPr>
         <w:br/>
-        <w:t xml:space="preserve">|/  </w:t>
+        <w:t xml:space="preserve">| * 6a084a3 Sprint I baseline: tested weight derivation, species-check fix, and engineering docs</w:t>
       </w:r>
       <w:r>
         <w:rPr>
@@ -9453,7 +9515,7 @@
           <w:szCs w:val="16"/>
         </w:rPr>
         <w:br/>
-        <w:t xml:space="preserve">* 3a05469 Hard Stop 2: add the fairness-by-shelter-characteristic check (Week 2 feedback, second half)</w:t>
+        <w:t xml:space="preserve">|/  </w:t>
       </w:r>
       <w:r>
         <w:rPr>
@@ -9462,7 +9524,7 @@
           <w:szCs w:val="16"/>
         </w:rPr>
         <w:br/>
-        <w:t xml:space="preserve">* 0257c38 Hard Stop 2: incorporate supervisor's approval and deterministic-blend requirement</w:t>
+        <w:t xml:space="preserve">* 3a05469 Hard Stop 2: add the fairness-by-shelter-characteristic check (Week 2 feedback, second half)</w:t>
       </w:r>
       <w:r>
         <w:rPr>
@@ -9471,7 +9533,7 @@
           <w:szCs w:val="16"/>
         </w:rPr>
         <w:br/>
-        <w:t xml:space="preserve">* c81224c Hard Stop 2: record both supervisor emails as sent; no further email, document in assignments</w:t>
+        <w:t xml:space="preserve">* 0257c38 Hard Stop 2: incorporate supervisor's approval and deterministic-blend requirement</w:t>
       </w:r>
     </w:p>
     <w:p>

</xml_diff>